<commit_message>
update author details and sequentialize 5-week schedule
</commit_message>
<xml_diff>
--- a/results/Research_Proposal_DAP391m.docx
+++ b/results/Research_Proposal_DAP391m.docx
@@ -103,7 +103,7 @@
           </w:tcPr>
           <w:p>
             <w:r>
-              <w:t>[Enter mentor name]</w:t>
+              <w:t>Nguyễn Hoàng Linh</w:t>
             </w:r>
           </w:p>
         </w:tc>
@@ -128,7 +128,7 @@
           </w:tcPr>
           <w:p>
             <w:r>
-              <w:t>[Full name 1 — Student ID]</w:t>
+              <w:t>Nguyễn Công Minh — SE203724</w:t>
             </w:r>
           </w:p>
         </w:tc>
@@ -153,7 +153,7 @@
           </w:tcPr>
           <w:p>
             <w:r>
-              <w:t>[Full name 2 — Student ID]</w:t>
+              <w:t>Võ Đức Nhật — SE203702</w:t>
             </w:r>
           </w:p>
         </w:tc>
@@ -178,7 +178,7 @@
           </w:tcPr>
           <w:p>
             <w:r>
-              <w:t>[Full name 3 — Student ID]</w:t>
+              <w:t>Trần Nguyễn Minh Hải — SE203718</w:t>
             </w:r>
           </w:p>
         </w:tc>
@@ -696,7 +696,7 @@
           </w:tcPr>
           <w:p>
             <w:r>
-              <w:t>Week 3-4</w:t>
+              <w:t>Week 4</w:t>
             </w:r>
           </w:p>
         </w:tc>
@@ -748,7 +748,7 @@
           </w:tcPr>
           <w:p>
             <w:r>
-              <w:t>Week 4</w:t>
+              <w:t>Week 4-5</w:t>
             </w:r>
           </w:p>
         </w:tc>

</xml_diff>

<commit_message>
merge week 4 tasks to eliminate duplicate rows and create a clean 5-week plan
</commit_message>
<xml_diff>
--- a/results/Research_Proposal_DAP391m.docx
+++ b/results/Research_Proposal_DAP391m.docx
@@ -706,7 +706,7 @@
           </w:tcPr>
           <w:p>
             <w:r>
-              <w:t>License-free max-k-cut solver (Numba + Kernighan-Lin) + validation</w:t>
+              <w:t>License-free solver implementation &amp; validation; modelling (RFM vs LRFM) &amp; multi-method comparison</w:t>
             </w:r>
           </w:p>
         </w:tc>
@@ -716,7 +716,7 @@
           </w:tcPr>
           <w:p>
             <w:r>
-              <w:t>Validated solver, test suite</w:t>
+              <w:t>Validated solver, test suite, and comparison/silhouette results</w:t>
             </w:r>
           </w:p>
         </w:tc>
@@ -739,58 +739,6 @@
           <w:p>
             <w:r>
               <w:t>5</w:t>
-            </w:r>
-          </w:p>
-        </w:tc>
-        <w:tc>
-          <w:tcPr>
-            <w:tcW w:type="dxa" w:w="1728"/>
-          </w:tcPr>
-          <w:p>
-            <w:r>
-              <w:t>Week 4</w:t>
-            </w:r>
-          </w:p>
-        </w:tc>
-        <w:tc>
-          <w:tcPr>
-            <w:tcW w:type="dxa" w:w="1728"/>
-          </w:tcPr>
-          <w:p>
-            <w:r>
-              <w:t>Modelling: RFM vs LRFM; multi-method comparison</w:t>
-            </w:r>
-          </w:p>
-        </w:tc>
-        <w:tc>
-          <w:tcPr>
-            <w:tcW w:type="dxa" w:w="1728"/>
-          </w:tcPr>
-          <w:p>
-            <w:r>
-              <w:t>Silhouette results, loyalty segments</w:t>
-            </w:r>
-          </w:p>
-        </w:tc>
-        <w:tc>
-          <w:tcPr>
-            <w:tcW w:type="dxa" w:w="1728"/>
-          </w:tcPr>
-          <w:p>
-            <w:r>
-              <w:t>Research team</w:t>
-            </w:r>
-          </w:p>
-        </w:tc>
-      </w:tr>
-      <w:tr>
-        <w:tc>
-          <w:tcPr>
-            <w:tcW w:type="dxa" w:w="1728"/>
-          </w:tcPr>
-          <w:p>
-            <w:r>
-              <w:t>6</w:t>
             </w:r>
           </w:p>
         </w:tc>

</xml_diff>